<commit_message>
Simplificar credencial y resumen de seguridad en pitch v8
</commit_message>
<xml_diff>
--- a/docs/specs/006-validacion-pitch-entrega/materiales/guion-pitch-v8.docx
+++ b/docs/specs/006-validacion-pitch-entrega/materiales/guion-pitch-v8.docx
@@ -142,7 +142,7 @@
     </w:p>
     <w:p>
       <w:r>
-        <w:t>Escaneen el QR y entren con la cuenta del jurado. Amazon Cognito, el servicio de acceso de Amazon en la nube, valida su identidad. Ustedes pueden consultar como auditores, sin modificar la operación. La conexión va cifrada. Dejamos esta pantalla para sus preguntas.</w:t>
+        <w:t>Escaneen el QR y entren con este usuario y clave. El acceso usa AWS Cognito en la nube de Amazon, con conexión cifrada. Entran como auditores: pueden ver todo el sistema sin modificar datos. Dejamos la pantalla para sus preguntas.</w:t>
       </w:r>
     </w:p>
     <w:p>
@@ -155,57 +155,57 @@
         <w:pStyle w:val="Heading1"/>
       </w:pPr>
       <w:r>
-        <w:t>Seguridad en diez líneas — apoyo para preguntas</w:t>
+        <w:t>Seguridad en diez líneas — AWS Cognito (nube)</w:t>
       </w:r>
     </w:p>
     <w:p>
       <w:r>
-        <w:t>1. Amazon Cognito es el servicio de acceso de AWS.</w:t>
+        <w:t>1. AWS Cognito valida el ingreso en la nube de Amazon.</w:t>
       </w:r>
     </w:p>
     <w:p>
       <w:r>
-        <w:t>2. AWS es la nube de Amazon: funciona por Internet.</w:t>
+        <w:t>2. Verifica usuario y clave antes de abrir el sistema.</w:t>
       </w:r>
     </w:p>
     <w:p>
       <w:r>
-        <w:t>3. Cognito comprueba el usuario y la contraseña.</w:t>
+        <w:t>3. La clave la protege Cognito, no nuestra base.</w:t>
       </w:r>
     </w:p>
     <w:p>
       <w:r>
-        <w:t>4. La contraseña la gestiona Cognito.</w:t>
+        <w:t>4. Al entrar entrega una sesión temporal.</w:t>
       </w:r>
     </w:p>
     <w:p>
       <w:r>
-        <w:t>5. La aplicación recibe una sesión temporal.</w:t>
+        <w:t>5. La conexión viaja cifrada por HTTPS.</w:t>
       </w:r>
     </w:p>
     <w:p>
       <w:r>
-        <w:t>6. Cada cuenta tiene permisos según su función.</w:t>
+        <w:t>6. Cada cuenta tiene permisos según su rol.</w:t>
       </w:r>
     </w:p>
     <w:p>
       <w:r>
-        <w:t>7. El jurado entra con el rol Auditor.</w:t>
+        <w:t>7. El jurado entra con rol Auditor.</w:t>
       </w:r>
     </w:p>
     <w:p>
       <w:r>
-        <w:t>8. Puede consultar; no modificar la operación.</w:t>
+        <w:t>8. Modo solo lectura: ver todo sin alterar datos.</w:t>
       </w:r>
     </w:p>
     <w:p>
       <w:r>
-        <w:t>9. La conexión usa HTTPS para cifrar los datos.</w:t>
+        <w:t>9. El servidor bloquea cualquier intento de edición.</w:t>
       </w:r>
     </w:p>
     <w:p>
       <w:r>
-        <w:t>10. La cuenta puede desactivarse al terminar.</w:t>
+        <w:t>10. La cuenta se desactiva al cerrar la evaluación.</w:t>
       </w:r>
     </w:p>
     <w:p>

</xml_diff>